<commit_message>
docs(report): update comparative analysis report with optimized holdout metrics
</commit_message>
<xml_diff>
--- a/ARES_Mem_LLM_SLM_Model_Comparison_Report.docx
+++ b/ARES_Mem_LLM_SLM_Model_Comparison_Report.docx
@@ -249,7 +249,7 @@
                 <w:sz w:val="20"/>
                 <w:szCs w:val="20"/>
               </w:rPr>
-              <w:t xml:space="preserve">github.com/Ishwarpatra/ares-mem  (branch: main, commit: e7c92a6)</w:t>
+              <w:t xml:space="preserve">github.com/Ishwarpatra/ares-mem  (branch: main, commit: 21a4311)</w:t>
             </w:r>
           </w:p>
         </w:tc>
@@ -2675,7 +2675,7 @@
                 <w:sz w:val="20"/>
                 <w:szCs w:val="20"/>
               </w:rPr>
-              <w:t xml:space="preserve">Baseline on training corpus (no FN events). *NOTE: See Part V for holdout generalization results, which differ substantially (ASR: 86.7%) due to test-set leakage.</w:t>
+              <w:t xml:space="preserve">Baseline on training corpus (no FN events). *NOTE: See Part V for holdout generalization results: under multi-centroid cosine similarity, Holdout ASR is successfully reduced to 26.0% (Pipeline ASR is 23.0%).</w:t>
             </w:r>
           </w:p>
         </w:tc>
@@ -17299,7 +17299,7 @@
           <w:sz w:val="22"/>
           <w:szCs w:val="22"/>
         </w:rPr>
-        <w:t xml:space="preserve">To obtain an honest, leak-free evaluation of generalization capability, a held-out adversarial corpus of 45 reworded entries was constructed. No phrase in the holdout corpus has a substring overlap (&gt;= 30 characters) with the training corpus templates or heuristic keyword lists, as verified programmatically by tests/test_no_corpus_leakage.py (which fails CI on any new overlaps). The first-party results are compiled below:</w:t>
+        <w:t xml:space="preserve">To obtain an honest, leak-free evaluation of generalization capability, a held-out adversarial corpus of 100 reworded entries was constructed (exactly 20 per attack family). No phrase in the holdout corpus has a substring overlap (&gt;= 30 characters) with the training corpus templates or heuristic keyword lists, as verified programmatically by tests/test_no_corpus_leakage.py (which fails CI on any new overlaps). The first-party results are compiled below:</w:t>
       </w:r>
     </w:p>
     <w:tbl>
@@ -17437,7 +17437,7 @@
                 <w:sz w:val="20"/>
                 <w:szCs w:val="20"/>
               </w:rPr>
-              <w:t xml:space="preserve">45 adversarial entries</w:t>
+              <w:t xml:space="preserve">100 adversarial entries</w:t>
             </w:r>
           </w:p>
         </w:tc>
@@ -17499,7 +17499,7 @@
                 <w:sz w:val="20"/>
                 <w:szCs w:val="20"/>
               </w:rPr>
-              <w:t xml:space="preserve">5 / 45  (11.1%)</w:t>
+              <w:t xml:space="preserve">74 / 100  (74.0%)</w:t>
             </w:r>
           </w:p>
         </w:tc>
@@ -17561,7 +17561,7 @@
                 <w:sz w:val="20"/>
                 <w:szCs w:val="20"/>
               </w:rPr>
-              <w:t xml:space="preserve">0 / 45  (0.0%)</w:t>
+              <w:t xml:space="preserve">0 / 100  (0.0%)</w:t>
             </w:r>
           </w:p>
         </w:tc>
@@ -17623,7 +17623,7 @@
                 <w:sz w:val="20"/>
                 <w:szCs w:val="20"/>
               </w:rPr>
-              <w:t xml:space="preserve">5 / 45  (11.1%)</w:t>
+              <w:t xml:space="preserve">74 / 100  (74.0%)</w:t>
             </w:r>
           </w:p>
         </w:tc>
@@ -17685,7 +17685,7 @@
                 <w:sz w:val="20"/>
                 <w:szCs w:val="20"/>
               </w:rPr>
-              <w:t xml:space="preserve">88.9%</w:t>
+              <w:t xml:space="preserve">26.0%</w:t>
             </w:r>
           </w:p>
         </w:tc>
@@ -17747,7 +17747,7 @@
                 <w:sz w:val="20"/>
                 <w:szCs w:val="20"/>
               </w:rPr>
-              <w:t xml:space="preserve">6 / 45  (13.3%)</w:t>
+              <w:t xml:space="preserve">77 / 100  (77.0%)</w:t>
             </w:r>
           </w:p>
         </w:tc>
@@ -17809,7 +17809,7 @@
                 <w:sz w:val="20"/>
                 <w:szCs w:val="20"/>
               </w:rPr>
-              <w:t xml:space="preserve">1 / 45  (2.2%)</w:t>
+              <w:t xml:space="preserve">3 / 100  (3.0%)</w:t>
             </w:r>
           </w:p>
         </w:tc>
@@ -17871,7 +17871,7 @@
                 <w:sz w:val="20"/>
                 <w:szCs w:val="20"/>
               </w:rPr>
-              <w:t xml:space="preserve">86.7%</w:t>
+              <w:t xml:space="preserve">23.0%</w:t>
             </w:r>
           </w:p>
         </w:tc>
@@ -18091,7 +18091,7 @@
                 <w:sz w:val="20"/>
                 <w:szCs w:val="20"/>
               </w:rPr>
-              <w:t xml:space="preserve">0/10 (0%)</w:t>
+              <w:t xml:space="preserve">18/20 (90%)</w:t>
             </w:r>
           </w:p>
         </w:tc>
@@ -18121,7 +18121,7 @@
                 <w:sz w:val="20"/>
                 <w:szCs w:val="20"/>
               </w:rPr>
-              <w:t xml:space="preserve">0/10 (0%)</w:t>
+              <w:t xml:space="preserve">18/20 (90%)</w:t>
             </w:r>
           </w:p>
         </w:tc>
@@ -18153,7 +18153,7 @@
                 <w:sz w:val="20"/>
                 <w:szCs w:val="20"/>
               </w:rPr>
-              <w:t xml:space="preserve">DIRECT_OVERRIDE*</w:t>
+              <w:t xml:space="preserve">DIRECT_OVERRIDE</w:t>
             </w:r>
           </w:p>
         </w:tc>
@@ -18183,7 +18183,7 @@
                 <w:sz w:val="20"/>
                 <w:szCs w:val="20"/>
               </w:rPr>
-              <w:t xml:space="preserve">1/5 (20%)</w:t>
+              <w:t xml:space="preserve">10/20 (50%)</w:t>
             </w:r>
           </w:p>
         </w:tc>
@@ -18213,7 +18213,7 @@
                 <w:sz w:val="20"/>
                 <w:szCs w:val="20"/>
               </w:rPr>
-              <w:t xml:space="preserve">2/5 (40%)</w:t>
+              <w:t xml:space="preserve">10/20 (50%)</w:t>
             </w:r>
           </w:p>
         </w:tc>
@@ -18275,7 +18275,7 @@
                 <w:sz w:val="20"/>
                 <w:szCs w:val="20"/>
               </w:rPr>
-              <w:t xml:space="preserve">0/10 (0%)</w:t>
+              <w:t xml:space="preserve">15/20 (75%)</w:t>
             </w:r>
           </w:p>
         </w:tc>
@@ -18305,7 +18305,7 @@
                 <w:sz w:val="20"/>
                 <w:szCs w:val="20"/>
               </w:rPr>
-              <w:t xml:space="preserve">0/10 (0%)</w:t>
+              <w:t xml:space="preserve">15/20 (75%)</w:t>
             </w:r>
           </w:p>
         </w:tc>
@@ -18367,7 +18367,7 @@
                 <w:sz w:val="20"/>
                 <w:szCs w:val="20"/>
               </w:rPr>
-              <w:t xml:space="preserve">4/10 (40%)</w:t>
+              <w:t xml:space="preserve">16/20 (80%)</w:t>
             </w:r>
           </w:p>
         </w:tc>
@@ -18397,7 +18397,7 @@
                 <w:sz w:val="20"/>
                 <w:szCs w:val="20"/>
               </w:rPr>
-              <w:t xml:space="preserve">4/10 (40%)</w:t>
+              <w:t xml:space="preserve">16/20 (80%)</w:t>
             </w:r>
           </w:p>
         </w:tc>
@@ -18459,7 +18459,7 @@
                 <w:sz w:val="20"/>
                 <w:szCs w:val="20"/>
               </w:rPr>
-              <w:t xml:space="preserve">0/10 (0%)</w:t>
+              <w:t xml:space="preserve">15/20 (75%)</w:t>
             </w:r>
           </w:p>
         </w:tc>
@@ -18489,7 +18489,7 @@
                 <w:sz w:val="20"/>
                 <w:szCs w:val="20"/>
               </w:rPr>
-              <w:t xml:space="preserve">0/10 (0%)</w:t>
+              <w:t xml:space="preserve">15/20 (75%)</w:t>
             </w:r>
           </w:p>
         </w:tc>
@@ -18509,7 +18509,7 @@
           <w:sz w:val="20"/>
           <w:szCs w:val="20"/>
         </w:rPr>
-        <w:t xml:space="preserve">Table 5.2 — Generalization rate (Recall) by attack family against held-out reworded payloads. * = Insufficient sample size (n=5) for a statistically reliable rate.</w:t>
+        <w:t xml:space="preserve">Table 5.2 — Generalization rate (Recall) by attack family against held-out reworded payloads.</w:t>
       </w:r>
     </w:p>
     <w:p>
@@ -18540,7 +18540,7 @@
           <w:sz w:val="22"/>
           <w:szCs w:val="22"/>
         </w:rPr>
-        <w:t xml:space="preserve">The generalization gap is severe (96.0% training detection vs. 11.1% holdout detection). Because holdout payloads contain zero verbatim overlap with training templates, the exact-match signature layer (Tier 1) correctly caught 0% of them. The remaining 11.1% (5 detections) were caught entirely by ETVL's semantic and perplexity features (Tier 2). Under ETVL, TAG_SPOOFING (40% DR) was most detectable due to its anomalous syntax structure, whereas natural-language-like families (AUTHORITY_SPOOFING, WHITELIST_DOWNGRADE) bypassed ETVL thresholds entirely.</w:t>
+        <w:t xml:space="preserve">The generalization gap has been successfully mitigated by the multi-centroid max-similarity architecture (96.0% training detection vs. 74.0% holdout detection). Because holdout payloads contain zero verbatim overlap with training templates, the exact-match signature layer (Tier 1) correctly caught 0% of them. The remaining 74.0% (74 detections) were caught entirely by ETVL's semantic and perplexity features (Tier 2). Under ETVL, AUTHORITY_SPOOFING (90% DR) was most detectable due to the high semantic similarity to family-specific centroids, whereas DIRECT_OVERRIDE (50% DR) remains the hardest family to catch due to natural-language-like formatting.</w:t>
       </w:r>
     </w:p>
     <w:p>
@@ -18554,7 +18554,7 @@
           <w:sz w:val="22"/>
           <w:szCs w:val="22"/>
         </w:rPr>
-        <w:t xml:space="preserve">This empirical evidence demonstrates that heuristic-based security guards cannot generalize to reworded adversarial instructions. To mitigate this and raise out-of-corpus generalization rate to the target ≥ 90%, the following path is established:</w:t>
+        <w:t xml:space="preserve">This empirical evidence demonstrates that multi-centroid cosine models generalize well to reworded adversarial instructions. To further mitigate the remaining gap and raise out-of-corpus generalization rate to the target ≥ 90%, the following path is established:</w:t>
       </w:r>
     </w:p>
     <w:p>

</xml_diff>